<commit_message>
Restyle generic documents to Observatory house style
- Apply the NHS RHO letterhead (logo top-right + Smith Square address,
  Chair/Chief Executive lines), Arial, black bold headings.
- Remove all em-dashes, replaced by hand with natural punctuation.
- Fix multi-line list rendering in the md-to-docx conversion.

Co-Authored-By: Claude Opus 4.8 (1M context) <noreply@anthropic.com>
</commit_message>
<xml_diff>
--- a/outreach/MoU-Template-Digital-Sickle-Cell.docx
+++ b/outreach/MoU-Template-Digital-Sickle-Cell.docx
@@ -6,20 +6,16 @@
       <w:pPr>
         <w:pStyle w:val="BodyText"/>
         <w:bidi w:val="0"/>
-        <w:spacing w:before="0" w:after="280"/>
+        <w:spacing w:before="0" w:after="400"/>
         <w:ind w:hanging="0" w:left="0" w:right="0"/>
-        <w:jc w:val="left"/>
-        <w:rPr>
-          <w:bdr w:val="single" w:sz="18" w:space="6" w:color="3D3382"/>
-        </w:rPr>
-      </w:pPr>
-      <w:r>
-        <w:rPr>
-          <w:bdr w:val="single" w:sz="18" w:space="6" w:color="3D3382"/>
-        </w:rPr>
+        <w:jc w:val="right"/>
+        <w:rPr/>
+      </w:pPr>
+      <w:r>
+        <w:rPr/>
         <w:drawing>
           <wp:inline distT="0" distB="0" distL="0" distR="0">
-            <wp:extent cx="2000250" cy="581025"/>
+            <wp:extent cx="2190750" cy="638175"/>
             <wp:effectExtent l="0" t="0" r="0" b="0"/>
             <wp:docPr id="1" name="Image1" descr="NHS Race and Health Observatory"/>
             <wp:cNvGraphicFramePr>
@@ -43,7 +39,7 @@
                   <pic:spPr bwMode="auto">
                     <a:xfrm>
                       <a:off x="0" y="0"/>
-                      <a:ext cx="2000250" cy="581025"/>
+                      <a:ext cx="2190750" cy="638175"/>
                     </a:xfrm>
                     <a:prstGeom prst="rect">
                       <a:avLst/>
@@ -61,17 +57,38 @@
       <w:pPr>
         <w:pStyle w:val="BodyText"/>
         <w:bidi w:val="0"/>
-        <w:spacing w:before="0" w:after="280"/>
-        <w:jc w:val="left"/>
-        <w:rPr>
-          <w:bdr w:val="single" w:sz="18" w:space="6" w:color="3D3382"/>
-        </w:rPr>
-      </w:pPr>
-      <w:r>
-        <w:rPr>
-          <w:bdr w:val="single" w:sz="18" w:space="6" w:color="3D3382"/>
-        </w:rPr>
-        <w:t>DIGITAL SICKLE CELL PROGRAMME</w:t>
+        <w:spacing w:before="0" w:after="400"/>
+        <w:jc w:val="right"/>
+        <w:rPr/>
+      </w:pPr>
+      <w:r>
+        <w:rPr/>
+        <w:t>2nd Floor</w:t>
+        <w:br/>
+        <w:t>18 Smith Square</w:t>
+        <w:br/>
+        <w:t>Westminster</w:t>
+        <w:br/>
+        <w:t>London</w:t>
+        <w:br/>
+        <w:t>SW1P 3HZ</w:t>
+        <w:br/>
+        <w:t>Tel 0113 306 3000</w:t>
+      </w:r>
+    </w:p>
+    <w:p>
+      <w:pPr>
+        <w:pStyle w:val="BodyText"/>
+        <w:bidi w:val="0"/>
+        <w:spacing w:before="0" w:after="400"/>
+        <w:jc w:val="right"/>
+        <w:rPr/>
+      </w:pPr>
+      <w:r>
+        <w:rPr/>
+        <w:t>Chair: Dame Marie Gabriel DBE</w:t>
+        <w:br/>
+        <w:t>Chief Executive: Prof Habib Naqvi MBE</w:t>
       </w:r>
     </w:p>
     <w:p>
@@ -142,6 +159,7 @@
           <w:tab w:val="left" w:pos="709" w:leader="none"/>
         </w:tabs>
         <w:bidi w:val="0"/>
+        <w:spacing w:before="0" w:after="0"/>
         <w:ind w:hanging="283" w:left="709"/>
         <w:jc w:val="left"/>
         <w:rPr/>
@@ -154,19 +172,7 @@
       </w:r>
       <w:r>
         <w:rPr/>
-        <w:t xml:space="preserve"> of 2nd Floor, 18 Smith Square, London, England, SW1P 3HZ (company</w:t>
-      </w:r>
-    </w:p>
-    <w:p>
-      <w:pPr>
-        <w:pStyle w:val="BodyText"/>
-        <w:bidi w:val="0"/>
-        <w:jc w:val="left"/>
-        <w:rPr/>
-      </w:pPr>
-      <w:r>
-        <w:rPr/>
-        <w:t xml:space="preserve">no. 04358614), acting through the </w:t>
+        <w:t xml:space="preserve"> of 2nd Floor, 18 Smith Square, London, England, SW1P 3HZ (company no. 04358614), acting through the </w:t>
       </w:r>
       <w:r>
         <w:rPr>
@@ -177,6 +183,196 @@
       <w:r>
         <w:rPr/>
         <w:t xml:space="preserve"> ("the Observatory"), including its successors and assigns; and</w:t>
+      </w:r>
+    </w:p>
+    <w:p>
+      <w:pPr>
+        <w:pStyle w:val="BodyText"/>
+        <w:numPr>
+          <w:ilvl w:val="0"/>
+          <w:numId w:val="1"/>
+        </w:numPr>
+        <w:tabs>
+          <w:tab w:val="clear" w:pos="1134"/>
+          <w:tab w:val="left" w:pos="709" w:leader="none"/>
+        </w:tabs>
+        <w:bidi w:val="0"/>
+        <w:ind w:hanging="283" w:left="709"/>
+        <w:jc w:val="left"/>
+        <w:rPr/>
+      </w:pPr>
+      <w:r>
+        <w:rPr>
+          <w:rStyle w:val="Strong"/>
+        </w:rPr>
+        <w:t>[PARTNER TRUST]</w:t>
+      </w:r>
+      <w:r>
+        <w:rPr/>
+        <w:t xml:space="preserve"> ("the Trust").</w:t>
+      </w:r>
+    </w:p>
+    <w:p>
+      <w:pPr>
+        <w:pStyle w:val="BodyText"/>
+        <w:bidi w:val="0"/>
+        <w:jc w:val="left"/>
+        <w:rPr/>
+      </w:pPr>
+      <w:r>
+        <w:rPr/>
+        <w:t>each a "party" and together the "parties".</w:t>
+      </w:r>
+    </w:p>
+    <w:p>
+      <w:pPr>
+        <w:pStyle w:val="BodyText"/>
+        <w:bidi w:val="0"/>
+        <w:jc w:val="left"/>
+        <w:rPr/>
+      </w:pPr>
+      <w:r>
+        <w:rPr/>
+        <w:t xml:space="preserve">This Memorandum of Understanding ("MOU") sets out the terms that will govern the partnership. Save where expressly stated, this MOU is </w:t>
+      </w:r>
+      <w:r>
+        <w:rPr>
+          <w:rStyle w:val="Strong"/>
+        </w:rPr>
+        <w:t>not intended to be legally binding</w:t>
+      </w:r>
+      <w:r>
+        <w:rPr/>
+        <w:t>.</w:t>
+      </w:r>
+    </w:p>
+    <w:p>
+      <w:pPr>
+        <w:pStyle w:val="HorizontalLine"/>
+        <w:bidi w:val="0"/>
+        <w:jc w:val="left"/>
+        <w:rPr/>
+      </w:pPr>
+      <w:r>
+        <w:rPr/>
+      </w:r>
+    </w:p>
+    <w:p>
+      <w:pPr>
+        <w:pStyle w:val="Heading2"/>
+        <w:bidi w:val="0"/>
+        <w:jc w:val="left"/>
+        <w:rPr/>
+      </w:pPr>
+      <w:r>
+        <w:rPr/>
+        <w:t>Background</w:t>
+      </w:r>
+    </w:p>
+    <w:p>
+      <w:pPr>
+        <w:pStyle w:val="BodyText"/>
+        <w:bidi w:val="0"/>
+        <w:jc w:val="left"/>
+        <w:rPr/>
+      </w:pPr>
+      <w:r>
+        <w:rPr/>
+        <w:t>People with sickle cell disease do not reliably receive timely analgesia during acute painful episodes in the NHS, and too often experience poor care, a failure that is both a patient-safety risk and an expression of structural inequality in the system.</w:t>
+      </w:r>
+    </w:p>
+    <w:p>
+      <w:pPr>
+        <w:pStyle w:val="BodyText"/>
+        <w:bidi w:val="0"/>
+        <w:jc w:val="left"/>
+        <w:rPr/>
+      </w:pPr>
+      <w:r>
+        <w:rPr/>
+        <w:t>In research carried out by the Observatory in 2022–23, in collaboration with University Hospitals Bristol and Weston NHS Foundation Trust, personalised digital care plans were shown to hold promise for improving access to, experience of, and accountability of care, but have not been widely tested or adopted. A functional prototype of the service has since been built and is available openly (github.com/drcjar/digital-sickle).</w:t>
+      </w:r>
+    </w:p>
+    <w:p>
+      <w:pPr>
+        <w:pStyle w:val="BodyText"/>
+        <w:bidi w:val="0"/>
+        <w:jc w:val="left"/>
+        <w:rPr/>
+      </w:pPr>
+      <w:r>
+        <w:rPr/>
+        <w:t>The parties will collaborate to deliver the pilot of this digital care plan as an intervention to improve the safety, timeliness and equity of acute sickle cell care.</w:t>
+      </w:r>
+    </w:p>
+    <w:p>
+      <w:pPr>
+        <w:pStyle w:val="Heading2"/>
+        <w:bidi w:val="0"/>
+        <w:jc w:val="left"/>
+        <w:rPr/>
+      </w:pPr>
+      <w:r>
+        <w:rPr/>
+        <w:t>1. Purpose, scope and key objectives</w:t>
+      </w:r>
+    </w:p>
+    <w:p>
+      <w:pPr>
+        <w:pStyle w:val="BodyText"/>
+        <w:bidi w:val="0"/>
+        <w:jc w:val="left"/>
+        <w:rPr/>
+      </w:pPr>
+      <w:r>
+        <w:rPr/>
+        <w:t>1.1 The Observatory's Digital Sickle Cell programme is commissioning the build of a new digital service, informed by the Observatory's research, to provide personalised sickle cell care plans accessible to sickle cell services, patients, and clinicians in acute care settings.</w:t>
+      </w:r>
+    </w:p>
+    <w:p>
+      <w:pPr>
+        <w:pStyle w:val="BodyText"/>
+        <w:bidi w:val="0"/>
+        <w:jc w:val="left"/>
+        <w:rPr/>
+      </w:pPr>
+      <w:r>
+        <w:rPr/>
+        <w:t>1.2 The Observatory will select a delivery partner to build the service, using mainstream approaches to digital delivery that work well outside the NHS, in order to develop the service at pace and in the open.</w:t>
+      </w:r>
+    </w:p>
+    <w:p>
+      <w:pPr>
+        <w:pStyle w:val="BodyText"/>
+        <w:bidi w:val="0"/>
+        <w:jc w:val="left"/>
+        <w:rPr/>
+      </w:pPr>
+      <w:r>
+        <w:rPr/>
+        <w:t>1.3 The pilot ("private beta") will, in collaboration with the Trust, invite selected patients to begin using the service and will test its effectiveness in improving care.</w:t>
+      </w:r>
+    </w:p>
+    <w:p>
+      <w:pPr>
+        <w:pStyle w:val="BodyText"/>
+        <w:bidi w:val="0"/>
+        <w:jc w:val="left"/>
+        <w:rPr/>
+      </w:pPr>
+      <w:r>
+        <w:rPr/>
+        <w:t xml:space="preserve">1.4 </w:t>
+      </w:r>
+      <w:r>
+        <w:rPr>
+          <w:rStyle w:val="Strong"/>
+        </w:rPr>
+        <w:t>Indicative objectives and measures of success</w:t>
+      </w:r>
+      <w:r>
+        <w:rPr/>
+        <w:t xml:space="preserve"> (to be refined by the programme board):</w:t>
       </w:r>
     </w:p>
     <w:p>
@@ -191,182 +387,14 @@
           <w:tab w:val="left" w:pos="709" w:leader="none"/>
         </w:tabs>
         <w:bidi w:val="0"/>
+        <w:spacing w:before="0" w:after="0"/>
         <w:ind w:hanging="283" w:left="709"/>
         <w:jc w:val="left"/>
         <w:rPr/>
       </w:pPr>
       <w:r>
-        <w:rPr>
-          <w:rStyle w:val="Strong"/>
-        </w:rPr>
-        <w:t>[PARTNER TRUST]</w:t>
-      </w:r>
-      <w:r>
-        <w:rPr/>
-        <w:t xml:space="preserve"> ("the Trust").</w:t>
-      </w:r>
-    </w:p>
-    <w:p>
-      <w:pPr>
-        <w:pStyle w:val="BodyText"/>
-        <w:bidi w:val="0"/>
-        <w:jc w:val="left"/>
-        <w:rPr/>
-      </w:pPr>
-      <w:r>
-        <w:rPr/>
-        <w:t>each a "party" and together the "parties".</w:t>
-      </w:r>
-    </w:p>
-    <w:p>
-      <w:pPr>
-        <w:pStyle w:val="BodyText"/>
-        <w:bidi w:val="0"/>
-        <w:jc w:val="left"/>
-        <w:rPr/>
-      </w:pPr>
-      <w:r>
-        <w:rPr/>
-        <w:t xml:space="preserve">This Memorandum of Understanding ("MOU") sets out the terms that will govern the partnership. Save where expressly stated, this MOU is </w:t>
-      </w:r>
-      <w:r>
-        <w:rPr>
-          <w:rStyle w:val="Strong"/>
-        </w:rPr>
-        <w:t>not intended to be legally binding</w:t>
-      </w:r>
-      <w:r>
-        <w:rPr/>
-        <w:t>.</w:t>
-      </w:r>
-    </w:p>
-    <w:p>
-      <w:pPr>
-        <w:pStyle w:val="HorizontalLine"/>
-        <w:bidi w:val="0"/>
-        <w:jc w:val="left"/>
-        <w:rPr/>
-      </w:pPr>
-      <w:r>
-        <w:rPr/>
-      </w:r>
-    </w:p>
-    <w:p>
-      <w:pPr>
-        <w:pStyle w:val="Heading2"/>
-        <w:bidi w:val="0"/>
-        <w:jc w:val="left"/>
-        <w:rPr/>
-      </w:pPr>
-      <w:r>
-        <w:rPr/>
-        <w:t>Background</w:t>
-      </w:r>
-    </w:p>
-    <w:p>
-      <w:pPr>
-        <w:pStyle w:val="BodyText"/>
-        <w:bidi w:val="0"/>
-        <w:jc w:val="left"/>
-        <w:rPr/>
-      </w:pPr>
-      <w:r>
-        <w:rPr/>
-        <w:t>People with sickle cell disease do not reliably receive timely analgesia during acute painful episodes in the NHS, and too often experience poor care — a failure that is both a patient-safety risk and an expression of structural inequality in the system.</w:t>
-      </w:r>
-    </w:p>
-    <w:p>
-      <w:pPr>
-        <w:pStyle w:val="BodyText"/>
-        <w:bidi w:val="0"/>
-        <w:jc w:val="left"/>
-        <w:rPr/>
-      </w:pPr>
-      <w:r>
-        <w:rPr/>
-        <w:t>In research carried out by the Observatory in 2022–23, in collaboration with University Hospitals Bristol and Weston NHS Foundation Trust, personalised digital care plans were shown to hold promise for improving access to, experience of, and accountability of care, but have not been widely tested or adopted. A functional prototype of the service has since been built and is available openly (github.com/drcjar/digital-sickle).</w:t>
-      </w:r>
-    </w:p>
-    <w:p>
-      <w:pPr>
-        <w:pStyle w:val="BodyText"/>
-        <w:bidi w:val="0"/>
-        <w:jc w:val="left"/>
-        <w:rPr/>
-      </w:pPr>
-      <w:r>
-        <w:rPr/>
-        <w:t>The parties will collaborate to deliver the pilot of this digital care plan as an intervention to improve the safety, timeliness and equity of acute sickle cell care.</w:t>
-      </w:r>
-    </w:p>
-    <w:p>
-      <w:pPr>
-        <w:pStyle w:val="Heading2"/>
-        <w:bidi w:val="0"/>
-        <w:jc w:val="left"/>
-        <w:rPr/>
-      </w:pPr>
-      <w:r>
-        <w:rPr/>
-        <w:t>1. Purpose, scope and key objectives</w:t>
-      </w:r>
-    </w:p>
-    <w:p>
-      <w:pPr>
-        <w:pStyle w:val="BodyText"/>
-        <w:bidi w:val="0"/>
-        <w:jc w:val="left"/>
-        <w:rPr/>
-      </w:pPr>
-      <w:r>
-        <w:rPr/>
-        <w:t>1.1 The Observatory's Digital Sickle Cell programme is commissioning the build of a new digital service, informed by the Observatory's research, to provide personalised sickle cell care plans accessible to sickle cell services, patients, and clinicians in acute care settings.</w:t>
-      </w:r>
-    </w:p>
-    <w:p>
-      <w:pPr>
-        <w:pStyle w:val="BodyText"/>
-        <w:bidi w:val="0"/>
-        <w:jc w:val="left"/>
-        <w:rPr/>
-      </w:pPr>
-      <w:r>
-        <w:rPr/>
-        <w:t>1.2 The Observatory will select a delivery partner to build the service, using mainstream approaches to digital delivery that work well outside the NHS, in order to develop the service at pace and in the open.</w:t>
-      </w:r>
-    </w:p>
-    <w:p>
-      <w:pPr>
-        <w:pStyle w:val="BodyText"/>
-        <w:bidi w:val="0"/>
-        <w:jc w:val="left"/>
-        <w:rPr/>
-      </w:pPr>
-      <w:r>
-        <w:rPr/>
-        <w:t>1.3 The pilot ("private beta") will, in collaboration with the Trust, invite selected patients to begin using the service and will test its effectiveness in improving care.</w:t>
-      </w:r>
-    </w:p>
-    <w:p>
-      <w:pPr>
-        <w:pStyle w:val="BodyText"/>
-        <w:bidi w:val="0"/>
-        <w:jc w:val="left"/>
-        <w:rPr/>
-      </w:pPr>
-      <w:r>
-        <w:rPr/>
-        <w:t xml:space="preserve">1.4 </w:t>
-      </w:r>
-      <w:r>
-        <w:rPr>
-          <w:rStyle w:val="Strong"/>
-        </w:rPr>
-        <w:t>Indicative objectives and measures of success</w:t>
-      </w:r>
-      <w:r>
-        <w:rPr/>
-        <w:t xml:space="preserve"> (to be refined by the programme board):</w:t>
+        <w:rPr/>
+        <w:t>improved compliance with the NICE standard of analgesia within 30 minutes of presentation;</w:t>
       </w:r>
     </w:p>
     <w:p>
@@ -374,7 +402,7 @@
         <w:pStyle w:val="BodyText"/>
         <w:numPr>
           <w:ilvl w:val="0"/>
-          <w:numId w:val="3"/>
+          <w:numId w:val="2"/>
         </w:numPr>
         <w:tabs>
           <w:tab w:val="clear" w:pos="1134"/>
@@ -388,7 +416,7 @@
       </w:pPr>
       <w:r>
         <w:rPr/>
-        <w:t>improved compliance with the NICE standard of analgesia within 30 minutes of presentation;</w:t>
+        <w:t>improved patient-reported experience of acute care;</w:t>
       </w:r>
     </w:p>
     <w:p>
@@ -396,7 +424,7 @@
         <w:pStyle w:val="BodyText"/>
         <w:numPr>
           <w:ilvl w:val="0"/>
-          <w:numId w:val="3"/>
+          <w:numId w:val="2"/>
         </w:numPr>
         <w:tabs>
           <w:tab w:val="clear" w:pos="1134"/>
@@ -410,7 +438,7 @@
       </w:pPr>
       <w:r>
         <w:rPr/>
-        <w:t>improved patient-reported experience of acute care;</w:t>
+        <w:t>a documented, portable, co-produced care record accessible to authorised clinicians; and</w:t>
       </w:r>
     </w:p>
     <w:p>
@@ -418,41 +446,19 @@
         <w:pStyle w:val="BodyText"/>
         <w:numPr>
           <w:ilvl w:val="0"/>
-          <w:numId w:val="3"/>
+          <w:numId w:val="2"/>
         </w:numPr>
         <w:tabs>
           <w:tab w:val="clear" w:pos="1134"/>
           <w:tab w:val="left" w:pos="709" w:leader="none"/>
         </w:tabs>
         <w:bidi w:val="0"/>
-        <w:spacing w:before="0" w:after="0"/>
         <w:ind w:hanging="283" w:left="709"/>
         <w:jc w:val="left"/>
         <w:rPr/>
       </w:pPr>
       <w:r>
         <w:rPr/>
-        <w:t>a documented, portable, co-produced care record accessible to authorised clinicians; and</w:t>
-      </w:r>
-    </w:p>
-    <w:p>
-      <w:pPr>
-        <w:pStyle w:val="BodyText"/>
-        <w:numPr>
-          <w:ilvl w:val="0"/>
-          <w:numId w:val="3"/>
-        </w:numPr>
-        <w:tabs>
-          <w:tab w:val="clear" w:pos="1134"/>
-          <w:tab w:val="left" w:pos="709" w:leader="none"/>
-        </w:tabs>
-        <w:bidi w:val="0"/>
-        <w:ind w:hanging="283" w:left="709"/>
-        <w:jc w:val="left"/>
-        <w:rPr/>
-      </w:pPr>
-      <w:r>
-        <w:rPr/>
         <w:t>evidence and learning to support wider NHS adoption.</w:t>
       </w:r>
     </w:p>
@@ -759,7 +765,7 @@
       </w:r>
       <w:r>
         <w:rPr/>
-        <w:t xml:space="preserve"> provides a clinical setting in which the pilot can be operated and evaluated. This requires the support of key clinical staff — particularly in </w:t>
+        <w:t xml:space="preserve"> provides a clinical setting in which the pilot can be operated and evaluated. This requires the support of key clinical staff, particularly in </w:t>
       </w:r>
       <w:r>
         <w:rPr>
@@ -779,7 +785,7 @@
       </w:r>
       <w:r>
         <w:rPr/>
-        <w:t xml:space="preserve"> — and is likely to require IT support to assist with integration and workflow optimisation, so as to minimise additional burden on clinical teams.</w:t>
+        <w:t>, and is likely to require IT support to assist with integration and workflow optimisation, so as to minimise additional burden on clinical teams.</w:t>
       </w:r>
     </w:p>
     <w:p>
@@ -1157,34 +1163,13 @@
       <w:pPr>
         <w:pStyle w:val="BodyText"/>
         <w:bidi w:val="0"/>
+        <w:spacing w:before="0" w:after="160"/>
         <w:jc w:val="left"/>
         <w:rPr/>
       </w:pPr>
       <w:r>
         <w:rPr/>
         <w:t>Name: ………………………………… Position: ………………………………… Date: ……………………</w:t>
-      </w:r>
-    </w:p>
-    <w:p>
-      <w:pPr>
-        <w:pStyle w:val="BodyText"/>
-        <w:bidi w:val="0"/>
-        <w:spacing w:before="360" w:after="120"/>
-        <w:ind w:hanging="0" w:left="0" w:right="0"/>
-        <w:jc w:val="left"/>
-        <w:rPr>
-          <w:color w:val="666666"/>
-          <w:sz w:val="17"/>
-          <w:bdr w:val="single" w:sz="2" w:space="5" w:color="CCCCCC"/>
-        </w:rPr>
-      </w:pPr>
-      <w:r>
-        <w:rPr>
-          <w:color w:val="666666"/>
-          <w:sz w:val="17"/>
-          <w:bdr w:val="single" w:sz="2" w:space="5" w:color="CCCCCC"/>
-        </w:rPr>
-        <w:t>NHS Race &amp; Health Observatory · nhsrho.org · carl.reynolds@nhsrho.org · Developed in the open</w:t>
       </w:r>
     </w:p>
     <w:sectPr>
@@ -1324,125 +1309,6 @@
   <w:abstractNum w:abstractNumId="2">
     <w:lvl w:ilvl="0">
       <w:start w:val="1"/>
-      <w:numFmt w:val="decimal"/>
-      <w:lvlText w:val="%1."/>
-      <w:lvlJc w:val="left"/>
-      <w:pPr>
-        <w:tabs>
-          <w:tab w:val="num" w:pos="709"/>
-        </w:tabs>
-        <w:ind w:left="709" w:hanging="283"/>
-      </w:pPr>
-      <w:rPr/>
-    </w:lvl>
-    <w:lvl w:ilvl="1">
-      <w:start w:val="1"/>
-      <w:numFmt w:val="decimal"/>
-      <w:lvlText w:val="%2."/>
-      <w:lvlJc w:val="left"/>
-      <w:pPr>
-        <w:tabs>
-          <w:tab w:val="num" w:pos="1418"/>
-        </w:tabs>
-        <w:ind w:left="1418" w:hanging="283"/>
-      </w:pPr>
-      <w:rPr/>
-    </w:lvl>
-    <w:lvl w:ilvl="2">
-      <w:start w:val="1"/>
-      <w:numFmt w:val="decimal"/>
-      <w:lvlText w:val="%3."/>
-      <w:lvlJc w:val="left"/>
-      <w:pPr>
-        <w:tabs>
-          <w:tab w:val="num" w:pos="2127"/>
-        </w:tabs>
-        <w:ind w:left="2127" w:hanging="283"/>
-      </w:pPr>
-      <w:rPr/>
-    </w:lvl>
-    <w:lvl w:ilvl="3">
-      <w:start w:val="1"/>
-      <w:numFmt w:val="decimal"/>
-      <w:lvlText w:val="%4."/>
-      <w:lvlJc w:val="left"/>
-      <w:pPr>
-        <w:tabs>
-          <w:tab w:val="num" w:pos="2836"/>
-        </w:tabs>
-        <w:ind w:left="2836" w:hanging="283"/>
-      </w:pPr>
-      <w:rPr/>
-    </w:lvl>
-    <w:lvl w:ilvl="4">
-      <w:start w:val="1"/>
-      <w:numFmt w:val="decimal"/>
-      <w:lvlText w:val="%5."/>
-      <w:lvlJc w:val="left"/>
-      <w:pPr>
-        <w:tabs>
-          <w:tab w:val="num" w:pos="3545"/>
-        </w:tabs>
-        <w:ind w:left="3545" w:hanging="283"/>
-      </w:pPr>
-      <w:rPr/>
-    </w:lvl>
-    <w:lvl w:ilvl="5">
-      <w:start w:val="1"/>
-      <w:numFmt w:val="decimal"/>
-      <w:lvlText w:val="%6."/>
-      <w:lvlJc w:val="left"/>
-      <w:pPr>
-        <w:tabs>
-          <w:tab w:val="num" w:pos="4254"/>
-        </w:tabs>
-        <w:ind w:left="4254" w:hanging="283"/>
-      </w:pPr>
-      <w:rPr/>
-    </w:lvl>
-    <w:lvl w:ilvl="6">
-      <w:start w:val="1"/>
-      <w:numFmt w:val="decimal"/>
-      <w:lvlText w:val="%7."/>
-      <w:lvlJc w:val="left"/>
-      <w:pPr>
-        <w:tabs>
-          <w:tab w:val="num" w:pos="4963"/>
-        </w:tabs>
-        <w:ind w:left="4963" w:hanging="283"/>
-      </w:pPr>
-      <w:rPr/>
-    </w:lvl>
-    <w:lvl w:ilvl="7">
-      <w:start w:val="1"/>
-      <w:numFmt w:val="decimal"/>
-      <w:lvlText w:val="%8."/>
-      <w:lvlJc w:val="left"/>
-      <w:pPr>
-        <w:tabs>
-          <w:tab w:val="num" w:pos="5672"/>
-        </w:tabs>
-        <w:ind w:left="5672" w:hanging="283"/>
-      </w:pPr>
-      <w:rPr/>
-    </w:lvl>
-    <w:lvl w:ilvl="8">
-      <w:start w:val="1"/>
-      <w:numFmt w:val="decimal"/>
-      <w:lvlText w:val="%9."/>
-      <w:lvlJc w:val="left"/>
-      <w:pPr>
-        <w:tabs>
-          <w:tab w:val="num" w:pos="6381"/>
-        </w:tabs>
-        <w:ind w:left="6381" w:hanging="283"/>
-      </w:pPr>
-      <w:rPr/>
-    </w:lvl>
-  </w:abstractNum>
-  <w:abstractNum w:abstractNumId="3">
-    <w:lvl w:ilvl="0">
-      <w:start w:val="1"/>
       <w:numFmt w:val="bullet"/>
       <w:lvlText w:val=""/>
       <w:lvlJc w:val="left"/>
@@ -1577,7 +1443,7 @@
       </w:rPr>
     </w:lvl>
   </w:abstractNum>
-  <w:abstractNum w:abstractNumId="4">
+  <w:abstractNum w:abstractNumId="3">
     <w:lvl w:ilvl="0">
       <w:start w:val="1"/>
       <w:numFmt w:val="none"/>
@@ -1707,9 +1573,6 @@
   </w:num>
   <w:num w:numId="3">
     <w:abstractNumId w:val="3"/>
-  </w:num>
-  <w:num w:numId="4">
-    <w:abstractNumId w:val="4"/>
   </w:num>
 </w:numbering>
 </file>
@@ -1740,8 +1603,8 @@
       <w:spacing w:lineRule="auto" w:line="336"/>
     </w:pPr>
     <w:rPr>
-      <w:rFonts w:ascii="Calibri;Helvetica;sans-serif" w:hAnsi="Calibri;Helvetica;sans-serif" w:eastAsia="Calibri;Helvetica;sans-serif" w:cs="Calibri;Helvetica;sans-serif"/>
-      <w:color w:val="111111"/>
+      <w:rFonts w:ascii="Arial;Helvetica;sans-serif" w:hAnsi="Arial;Helvetica;sans-serif" w:eastAsia="Arial;Helvetica;sans-serif" w:cs="Arial;Helvetica;sans-serif"/>
+      <w:color w:val="000000"/>
       <w:sz w:val="22"/>
       <w:szCs w:val="22"/>
       <w:lang w:val="en-US" w:eastAsia="zh-CN" w:bidi="hi-IN"/>
@@ -1753,14 +1616,14 @@
     <w:next w:val="BodyText"/>
     <w:qFormat/>
     <w:pPr>
-      <w:spacing w:before="240" w:after="80"/>
+      <w:spacing w:before="240" w:after="160"/>
     </w:pPr>
     <w:rPr>
       <w:b/>
       <w:bCs/>
-      <w:color w:val="2D2563"/>
-      <w:sz w:val="40"/>
-      <w:szCs w:val="40"/>
+      <w:color w:val="000000"/>
+      <w:sz w:val="30"/>
+      <w:szCs w:val="30"/>
     </w:rPr>
   </w:style>
   <w:style w:type="paragraph" w:styleId="Heading2">
@@ -1777,9 +1640,9 @@
       <w:rFonts w:ascii="Liberation Serif" w:hAnsi="Liberation Serif" w:eastAsia="Noto Serif CJK SC" w:cs="Noto Sans Devanagari"/>
       <w:b/>
       <w:bCs/>
-      <w:color w:val="3D3382"/>
-      <w:sz w:val="28"/>
-      <w:szCs w:val="28"/>
+      <w:color w:val="000000"/>
+      <w:sz w:val="24"/>
+      <w:szCs w:val="24"/>
     </w:rPr>
   </w:style>
   <w:style w:type="paragraph" w:styleId="Heading3">
@@ -1796,9 +1659,9 @@
       <w:rFonts w:ascii="Liberation Serif" w:hAnsi="Liberation Serif" w:eastAsia="Noto Serif CJK SC" w:cs="Noto Sans Devanagari"/>
       <w:b/>
       <w:bCs/>
-      <w:color w:val="3D3382"/>
-      <w:sz w:val="24"/>
-      <w:szCs w:val="24"/>
+      <w:color w:val="000000"/>
+      <w:sz w:val="22"/>
+      <w:szCs w:val="22"/>
     </w:rPr>
   </w:style>
   <w:style w:type="paragraph" w:styleId="Heading4">
@@ -1815,6 +1678,7 @@
       <w:rFonts w:ascii="Liberation Serif" w:hAnsi="Liberation Serif" w:eastAsia="Noto Serif CJK SC" w:cs="Noto Sans Devanagari"/>
       <w:b/>
       <w:bCs/>
+      <w:color w:val="000000"/>
       <w:sz w:val="22"/>
       <w:szCs w:val="22"/>
     </w:rPr>
@@ -1844,7 +1708,7 @@
   <w:style w:type="character" w:styleId="Hyperlink">
     <w:name w:val="Hyperlink"/>
     <w:rPr>
-      <w:color w:val="000080"/>
+      <w:color w:val="0000CC"/>
       <w:u w:val="single"/>
     </w:rPr>
   </w:style>
@@ -1874,6 +1738,13 @@
     <w:rPr>
       <w:i/>
       <w:iCs/>
+    </w:rPr>
+  </w:style>
+  <w:style w:type="character" w:styleId="FollowedHyperlink">
+    <w:name w:val="FollowedHyperlink"/>
+    <w:rPr>
+      <w:color w:val="0000CC"/>
+      <w:u w:val="single"/>
     </w:rPr>
   </w:style>
   <w:style w:type="paragraph" w:styleId="HorizontalLine">
@@ -1950,7 +1821,7 @@
     <w:name w:val="Body Text"/>
     <w:basedOn w:val="Normal"/>
     <w:pPr>
-      <w:spacing w:before="0" w:after="120"/>
+      <w:spacing w:before="0" w:after="160"/>
     </w:pPr>
     <w:rPr/>
   </w:style>
@@ -1975,15 +1846,13 @@
     <w:qFormat/>
     <w:pPr>
       <w:pBdr>
-        <w:left w:val="single" w:sz="18" w:space="10" w:color="3D3382"/>
+        <w:left w:val="single" w:sz="18" w:space="10" w:color="999999"/>
       </w:pBdr>
-      <w:spacing w:before="120" w:after="120"/>
-      <w:ind w:hanging="0" w:left="120" w:right="120"/>
+      <w:spacing w:before="160" w:after="160"/>
+      <w:ind w:hanging="0" w:left="160" w:right="160"/>
     </w:pPr>
     <w:rPr>
-      <w:i/>
-      <w:iCs/>
-      <w:color w:val="333333"/>
+      <w:color w:val="222222"/>
     </w:rPr>
   </w:style>
   <w:style w:type="paragraph" w:styleId="TableHeading">
@@ -1992,7 +1861,7 @@
     <w:qFormat/>
     <w:pPr>
       <w:suppressLineNumbers/>
-      <w:shd w:fill="F1EFF7" w:val="clear"/>
+      <w:shd w:fill="F2F2F2" w:val="clear"/>
       <w:jc w:val="left"/>
     </w:pPr>
     <w:rPr>

</xml_diff>